<commit_message>
Simplify Waste Expo WasteVantage invite email
Shorter, to-the-point invite covering expo visit, WasteVantage
benefits, and why to stop by the stand (Word + Markdown).

Co-authored-by: hendrikdamai-art <hendrik.damai@gmail.com>
</commit_message>
<xml_diff>
--- a/research/WasteExpo_2026_WasteVantage_Invite_Email.docx
+++ b/research/WasteExpo_2026_WasteVantage_Invite_Email.docx
@@ -10,24 +10,22 @@
           <w:color w:val="1F4E79"/>
           <w:sz w:val="36"/>
         </w:rPr>
-        <w:t>Waste Expo Australia 2026 — WasteVantage Invite Email</w:t>
+        <w:t>Waste Expo 2026 — WasteVantage invite email</w:t>
       </w:r>
     </w:p>
     <w:p>
       <w:pPr>
-        <w:spacing w:after="120"/>
+        <w:spacing w:after="240"/>
       </w:pPr>
       <w:r>
         <w:rPr>
           <w:rFonts w:ascii="Calibri" w:hAnsi="Calibri"/>
           <w:b w:val="0"/>
-          <w:i/>
-          <w:sz w:val="20"/>
+          <w:sz w:val="22"/>
         </w:rPr>
-        <w:t>Ready-to-send outreach email for skip bin, rearlift, and garden bag operators.</w:t>
+        <w:t>Simple, ready-to-send version. Replace {{placeholders}} before sending.</w:t>
       </w:r>
     </w:p>
-    <w:p/>
     <w:p>
       <w:r>
         <w:rPr>
@@ -40,90 +38,16 @@
       </w:r>
     </w:p>
     <w:p>
-      <w:r>
-        <w:rPr>
-          <w:b/>
-          <w:sz w:val="22"/>
-        </w:rPr>
-        <w:t xml:space="preserve">Event: </w:t>
-      </w:r>
-      <w:r>
-        <w:rPr>
-          <w:sz w:val="22"/>
-        </w:rPr>
-        <w:t>Waste Expo Australia</w:t>
-      </w:r>
-    </w:p>
-    <w:p>
-      <w:r>
-        <w:rPr>
-          <w:b/>
-          <w:sz w:val="22"/>
-        </w:rPr>
-        <w:t xml:space="preserve">Dates: </w:t>
-      </w:r>
-      <w:r>
-        <w:rPr>
-          <w:sz w:val="22"/>
-        </w:rPr>
-        <w:t>Wednesday 28 – Thursday 29 October 2026, 9am–5pm</w:t>
-      </w:r>
-    </w:p>
-    <w:p>
-      <w:r>
-        <w:rPr>
-          <w:b/>
-          <w:sz w:val="22"/>
-        </w:rPr>
-        <w:t xml:space="preserve">Venue: </w:t>
-      </w:r>
-      <w:r>
-        <w:rPr>
-          <w:sz w:val="22"/>
-        </w:rPr>
-        <w:t>Melbourne Convention and Exhibition Centre (MCEC), South Wharf</w:t>
-      </w:r>
-    </w:p>
-    <w:p>
-      <w:r>
-        <w:rPr>
-          <w:b/>
-          <w:sz w:val="22"/>
-        </w:rPr>
-        <w:t xml:space="preserve">Expo website: </w:t>
-      </w:r>
-      <w:r>
-        <w:rPr>
-          <w:sz w:val="22"/>
-        </w:rPr>
-        <w:t>https://www.wasteexpoaustralia.com.au/</w:t>
-      </w:r>
-    </w:p>
-    <w:p>
-      <w:r>
-        <w:rPr>
-          <w:b/>
-          <w:sz w:val="22"/>
-        </w:rPr>
-        <w:t xml:space="preserve">WasteVantage: </w:t>
-      </w:r>
-      <w:r>
-        <w:rPr>
-          <w:sz w:val="22"/>
-        </w:rPr>
-        <w:t>https://ihublogistics.com/wastevantage/</w:t>
-      </w:r>
-    </w:p>
-    <w:p/>
-    <w:p>
+      <w:pPr>
+        <w:spacing w:after="120"/>
+      </w:pPr>
       <w:r>
         <w:rPr>
           <w:rFonts w:ascii="Calibri" w:hAnsi="Calibri"/>
-          <w:b/>
-          <w:color w:val="1F4E79"/>
-          <w:sz w:val="28"/>
+          <w:b w:val="0"/>
+          <w:sz w:val="22"/>
         </w:rPr>
-        <w:t>Subject lines (pick one)</w:t>
+        <w:t>Event: Waste Expo Australia</w:t>
       </w:r>
     </w:p>
     <w:p>
@@ -134,10 +58,9 @@
         <w:rPr>
           <w:rFonts w:ascii="Calibri" w:hAnsi="Calibri"/>
           <w:b w:val="0"/>
-          <w:i w:val="0"/>
           <w:sz w:val="22"/>
         </w:rPr>
-        <w:t>1. {{Company Name}} — meet WasteVantage at Waste Expo Australia (28–29 Oct)</w:t>
+        <w:t>Dates: 28–29 October 2026, 9am–5pm</w:t>
       </w:r>
     </w:p>
     <w:p>
@@ -148,10 +71,9 @@
         <w:rPr>
           <w:rFonts w:ascii="Calibri" w:hAnsi="Calibri"/>
           <w:b w:val="0"/>
-          <w:i w:val="0"/>
           <w:sz w:val="22"/>
         </w:rPr>
-        <w:t>2. Invitation: see WasteVantage live at Waste Expo Melbourne, 28–29 October</w:t>
+        <w:t>Venue: MCEC, Melbourne</w:t>
       </w:r>
     </w:p>
     <w:p>
@@ -162,13 +84,48 @@
         <w:rPr>
           <w:rFonts w:ascii="Calibri" w:hAnsi="Calibri"/>
           <w:b w:val="0"/>
-          <w:i w:val="0"/>
           <w:sz w:val="22"/>
         </w:rPr>
-        <w:t>3. Skip / rearlift / garden bag ops: visit us at Waste Expo Australia 2026</w:t>
+        <w:t>Expo: https://www.wasteexpoaustralia.com.au/</w:t>
       </w:r>
     </w:p>
-    <w:p/>
+    <w:p>
+      <w:pPr>
+        <w:spacing w:after="240"/>
+      </w:pPr>
+      <w:r>
+        <w:rPr>
+          <w:rFonts w:ascii="Calibri" w:hAnsi="Calibri"/>
+          <w:b w:val="0"/>
+          <w:sz w:val="22"/>
+        </w:rPr>
+        <w:t>WasteVantage: https://ihublogistics.com/wastevantage/</w:t>
+      </w:r>
+    </w:p>
+    <w:p>
+      <w:r>
+        <w:rPr>
+          <w:rFonts w:ascii="Calibri" w:hAnsi="Calibri"/>
+          <w:b/>
+          <w:color w:val="1F4E79"/>
+          <w:sz w:val="28"/>
+        </w:rPr>
+        <w:t>Subject</w:t>
+      </w:r>
+    </w:p>
+    <w:p>
+      <w:pPr>
+        <w:spacing w:after="240"/>
+      </w:pPr>
+      <w:r>
+        <w:rPr>
+          <w:rFonts w:ascii="Calibri" w:hAnsi="Calibri"/>
+          <w:b w:val="0"/>
+          <w:sz w:val="22"/>
+        </w:rPr>
+        <w:t>Visit WasteVantage at Waste Expo Australia — 28–29 Oct</w:t>
+      </w:r>
+    </w:p>
     <w:p>
       <w:r>
         <w:rPr>
@@ -181,132 +138,16 @@
       </w:r>
     </w:p>
     <w:p>
-      <w:r>
-        <w:rPr>
-          <w:b/>
-          <w:sz w:val="22"/>
-        </w:rPr>
-        <w:t xml:space="preserve">To: </w:t>
-      </w:r>
-      <w:r>
-        <w:rPr>
-          <w:sz w:val="22"/>
-        </w:rPr>
-        <w:t>{{Contact Email}}</w:t>
-      </w:r>
-    </w:p>
-    <w:p>
-      <w:r>
-        <w:rPr>
-          <w:b/>
-          <w:sz w:val="22"/>
-        </w:rPr>
-        <w:t xml:space="preserve">From: </w:t>
-      </w:r>
-      <w:r>
-        <w:rPr>
-          <w:sz w:val="22"/>
-        </w:rPr>
-        <w:t>WasteVantage team</w:t>
-      </w:r>
-    </w:p>
-    <w:p/>
-    <w:p>
       <w:pPr>
-        <w:spacing w:after="80"/>
+        <w:spacing w:after="120"/>
       </w:pPr>
       <w:r>
         <w:rPr>
           <w:rFonts w:ascii="Calibri" w:hAnsi="Calibri"/>
           <w:b w:val="0"/>
-          <w:i w:val="0"/>
           <w:sz w:val="22"/>
         </w:rPr>
         <w:t>Hi {{First Name / team at Company Name}},</w:t>
-      </w:r>
-    </w:p>
-    <w:p/>
-    <w:p>
-      <w:pPr>
-        <w:spacing w:after="80"/>
-      </w:pPr>
-      <w:r>
-        <w:rPr>
-          <w:rFonts w:ascii="Calibri" w:hAnsi="Calibri"/>
-          <w:b w:val="0"/>
-          <w:i w:val="0"/>
-          <w:sz w:val="22"/>
-        </w:rPr>
-        <w:t>We're writing from WasteVantage to invite you to visit us at Waste Expo Australia 2026.</w:t>
-      </w:r>
-    </w:p>
-    <w:p/>
-    <w:p>
-      <w:pPr>
-        <w:spacing w:after="80"/>
-      </w:pPr>
-      <w:r>
-        <w:rPr>
-          <w:rFonts w:ascii="Calibri" w:hAnsi="Calibri"/>
-          <w:b w:val="0"/>
-          <w:i w:val="0"/>
-          <w:sz w:val="22"/>
-        </w:rPr>
-        <w:t>When: Wednesday 28 – Thursday 29 October 2026, 9am–5pm</w:t>
-      </w:r>
-    </w:p>
-    <w:p>
-      <w:pPr>
-        <w:spacing w:after="80"/>
-      </w:pPr>
-      <w:r>
-        <w:rPr>
-          <w:rFonts w:ascii="Calibri" w:hAnsi="Calibri"/>
-          <w:b w:val="0"/>
-          <w:i w:val="0"/>
-          <w:sz w:val="22"/>
-        </w:rPr>
-        <w:t>Where: Melbourne Convention and Exhibition Centre (MCEC)</w:t>
-      </w:r>
-    </w:p>
-    <w:p>
-      <w:pPr>
-        <w:spacing w:after="80"/>
-      </w:pPr>
-      <w:r>
-        <w:rPr>
-          <w:rFonts w:ascii="Calibri" w:hAnsi="Calibri"/>
-          <w:b w:val="0"/>
-          <w:i w:val="0"/>
-          <w:sz w:val="22"/>
-        </w:rPr>
-        <w:t>Event: https://www.wasteexpoaustralia.com.au/</w:t>
-      </w:r>
-    </w:p>
-    <w:p/>
-    <w:p>
-      <w:pPr>
-        <w:spacing w:after="80"/>
-      </w:pPr>
-      <w:r>
-        <w:rPr>
-          <w:rFonts w:ascii="Calibri" w:hAnsi="Calibri"/>
-          <w:b w:val="0"/>
-          <w:i w:val="0"/>
-          <w:sz w:val="22"/>
-        </w:rPr>
-        <w:t>Waste Expo is Australia's leading gathering for waste, recycling and resource recovery — with 3,500+ attendees, 140+ exhibitors and free education sessions. It's the best place this year to see what's next for operators like yours.</w:t>
-      </w:r>
-    </w:p>
-    <w:p>
-      <w:r>
-        <w:rPr>
-          <w:rFonts w:ascii="Calibri" w:hAnsi="Calibri"/>
-          <w:b/>
-          <w:color w:val="1F4E79"/>
-          <w:sz w:val="26"/>
-        </w:rPr>
-        <w:t>Why visit WasteVantage at the expo?</w:t>
       </w:r>
     </w:p>
     <w:p>
@@ -317,10 +158,84 @@
         <w:rPr>
           <w:rFonts w:ascii="Calibri" w:hAnsi="Calibri"/>
           <w:b w:val="0"/>
-          <w:i w:val="0"/>
           <w:sz w:val="22"/>
         </w:rPr>
-        <w:t>WasteVantage is purpose-built waste management software for Australian and New Zealand operators — including skip bin hire, rearlift / wheelie bin rounds, front lift, and garden / skip bag style services.</w:t>
+      </w:r>
+    </w:p>
+    <w:p>
+      <w:pPr>
+        <w:spacing w:after="120"/>
+      </w:pPr>
+      <w:r>
+        <w:rPr>
+          <w:rFonts w:ascii="Calibri" w:hAnsi="Calibri"/>
+          <w:b w:val="0"/>
+          <w:sz w:val="22"/>
+        </w:rPr>
+        <w:t>You’re invited to visit WasteVantage at Waste Expo Australia.</w:t>
+      </w:r>
+    </w:p>
+    <w:p>
+      <w:pPr>
+        <w:spacing w:after="120"/>
+      </w:pPr>
+      <w:r>
+        <w:rPr>
+          <w:rFonts w:ascii="Calibri" w:hAnsi="Calibri"/>
+          <w:b w:val="0"/>
+          <w:sz w:val="22"/>
+        </w:rPr>
+      </w:r>
+    </w:p>
+    <w:p>
+      <w:pPr>
+        <w:spacing w:after="120"/>
+      </w:pPr>
+      <w:r>
+        <w:rPr>
+          <w:rFonts w:ascii="Calibri" w:hAnsi="Calibri"/>
+          <w:b w:val="0"/>
+          <w:sz w:val="22"/>
+        </w:rPr>
+        <w:t>When: 28–29 October 2026, 9am–5pm</w:t>
+      </w:r>
+    </w:p>
+    <w:p>
+      <w:pPr>
+        <w:spacing w:after="120"/>
+      </w:pPr>
+      <w:r>
+        <w:rPr>
+          <w:rFonts w:ascii="Calibri" w:hAnsi="Calibri"/>
+          <w:b w:val="0"/>
+          <w:sz w:val="22"/>
+        </w:rPr>
+        <w:t>Where: MCEC, Melbourne</w:t>
+      </w:r>
+    </w:p>
+    <w:p>
+      <w:pPr>
+        <w:spacing w:after="120"/>
+      </w:pPr>
+      <w:r>
+        <w:rPr>
+          <w:rFonts w:ascii="Calibri" w:hAnsi="Calibri"/>
+          <w:b w:val="0"/>
+          <w:sz w:val="22"/>
+        </w:rPr>
+        <w:t>Register / event info: https://www.wasteexpoaustralia.com.au/</w:t>
+      </w:r>
+    </w:p>
+    <w:p>
+      <w:pPr>
+        <w:spacing w:after="120"/>
+      </w:pPr>
+      <w:r>
+        <w:rPr>
+          <w:rFonts w:ascii="Calibri" w:hAnsi="Calibri"/>
+          <w:b w:val="0"/>
+          <w:sz w:val="22"/>
+        </w:rPr>
       </w:r>
     </w:p>
     <w:p>
@@ -331,10 +246,35 @@
         <w:rPr>
           <w:rFonts w:ascii="Calibri" w:hAnsi="Calibri"/>
           <w:b/>
-          <w:i w:val="0"/>
           <w:sz w:val="22"/>
         </w:rPr>
-        <w:t>At our stand you can:</w:t>
+        <w:t>Why visit us at the expo?</w:t>
+      </w:r>
+    </w:p>
+    <w:p>
+      <w:pPr>
+        <w:spacing w:after="120"/>
+      </w:pPr>
+      <w:r>
+        <w:rPr>
+          <w:rFonts w:ascii="Calibri" w:hAnsi="Calibri"/>
+          <w:b w:val="0"/>
+          <w:sz w:val="22"/>
+        </w:rPr>
+        <w:t>WasteVantage is software built for waste operators like you — skip bins, rearlift / wheelie bins, and garden bags.</w:t>
+      </w:r>
+    </w:p>
+    <w:p>
+      <w:pPr>
+        <w:spacing w:after="120"/>
+      </w:pPr>
+      <w:r>
+        <w:rPr>
+          <w:rFonts w:ascii="Calibri" w:hAnsi="Calibri"/>
+          <w:b w:val="0"/>
+          <w:sz w:val="22"/>
+        </w:rPr>
+        <w:t>In a short stand visit you can:</w:t>
       </w:r>
     </w:p>
     <w:p>
@@ -346,7 +286,7 @@
           <w:rFonts w:ascii="Calibri" w:hAnsi="Calibri"/>
           <w:sz w:val="22"/>
         </w:rPr>
-        <w:t>See a live demo of bookings, dispatch, bin tracking and driver run sheets in one system</w:t>
+        <w:t>See how bookings, dispatch, bin tracking and invoicing work in one system</w:t>
       </w:r>
     </w:p>
     <w:p>
@@ -358,7 +298,7 @@
           <w:rFonts w:ascii="Calibri" w:hAnsi="Calibri"/>
           <w:sz w:val="22"/>
         </w:rPr>
-        <w:t>Talk through your operation (skip delivery/pickup, rearlift schedules, garden bag collections) with people who understand the workflow</w:t>
+        <w:t>Ask how it fits your operation</w:t>
       </w:r>
     </w:p>
     <w:p>
@@ -370,7 +310,32 @@
           <w:rFonts w:ascii="Calibri" w:hAnsi="Calibri"/>
           <w:sz w:val="22"/>
         </w:rPr>
-        <w:t>Compare how you run today vs automating pricing, job scheduling, customer SMS and same-day invoicing</w:t>
+        <w:t>Get a clear answer on whether it can cut admin and missed jobs</w:t>
+      </w:r>
+    </w:p>
+    <w:p>
+      <w:pPr>
+        <w:spacing w:after="120"/>
+      </w:pPr>
+      <w:r>
+        <w:rPr>
+          <w:rFonts w:ascii="Calibri" w:hAnsi="Calibri"/>
+          <w:b w:val="0"/>
+          <w:sz w:val="22"/>
+        </w:rPr>
+      </w:r>
+    </w:p>
+    <w:p>
+      <w:pPr>
+        <w:spacing w:after="120"/>
+      </w:pPr>
+      <w:r>
+        <w:rPr>
+          <w:rFonts w:ascii="Calibri" w:hAnsi="Calibri"/>
+          <w:b/>
+          <w:sz w:val="22"/>
+        </w:rPr>
+        <w:t>What you get from WasteVantage</w:t>
       </w:r>
     </w:p>
     <w:p>
@@ -382,7 +347,7 @@
           <w:rFonts w:ascii="Calibri" w:hAnsi="Calibri"/>
           <w:sz w:val="22"/>
         </w:rPr>
-        <w:t>Ask about Xero / MYOB / Stripe integrations so office admin and cash flow stay connected</w:t>
+        <w:t>Online bookings and clearer scheduling</w:t>
       </w:r>
     </w:p>
     <w:p>
@@ -394,19 +359,31 @@
           <w:rFonts w:ascii="Calibri" w:hAnsi="Calibri"/>
           <w:sz w:val="22"/>
         </w:rPr>
-        <w:t>Get a clear view of whether WasteVantage fits a single-stream business or a multi-stream fleet (skips + rearlift + bags)</w:t>
+        <w:t>Better visibility of bins and jobs</w:t>
       </w:r>
     </w:p>
-    <w:p/>
     <w:p>
+      <w:pPr>
+        <w:pStyle w:val="ListBullet"/>
+      </w:pPr>
       <w:r>
         <w:rPr>
           <w:rFonts w:ascii="Calibri" w:hAnsi="Calibri"/>
-          <w:b/>
-          <w:color w:val="1F4E79"/>
-          <w:sz w:val="26"/>
+          <w:sz w:val="22"/>
         </w:rPr>
-        <w:t>What WasteVantage can do for {{Company Name}}</w:t>
+        <w:t>Faster invoicing (including Xero / MYOB)</w:t>
+      </w:r>
+    </w:p>
+    <w:p>
+      <w:pPr>
+        <w:pStyle w:val="ListBullet"/>
+      </w:pPr>
+      <w:r>
+        <w:rPr>
+          <w:rFonts w:ascii="Calibri" w:hAnsi="Calibri"/>
+          <w:sz w:val="22"/>
+        </w:rPr>
+        <w:t>One platform if you run skips, rearlift and bags together</w:t>
       </w:r>
     </w:p>
     <w:p>
@@ -417,226 +394,11 @@
         <w:rPr>
           <w:rFonts w:ascii="Calibri" w:hAnsi="Calibri"/>
           <w:b w:val="0"/>
-          <w:i w:val="0"/>
           <w:sz w:val="22"/>
         </w:rPr>
-        <w:t>If you're juggling phone bookings, spreadsheets, drivers and invoices, the expo is a low-risk way to see how operators are cutting admin and missed jobs:</w:t>
+        <w:t>Built for Australian waste operators — not a generic overseas tool.</w:t>
       </w:r>
     </w:p>
-    <w:tbl>
-      <w:tblPr>
-        <w:tblStyle w:val="TableGrid"/>
-        <w:tblW w:type="auto" w:w="0"/>
-        <w:tblLook w:firstColumn="1" w:firstRow="1" w:lastColumn="0" w:lastRow="0" w:noHBand="0" w:noVBand="1" w:val="04A0"/>
-      </w:tblPr>
-      <w:tblGrid>
-        <w:gridCol w:w="4680"/>
-        <w:gridCol w:w="4680"/>
-      </w:tblGrid>
-      <w:tr>
-        <w:tc>
-          <w:tcPr>
-            <w:tcW w:type="dxa" w:w="4680"/>
-            <w:shd w:fill="1F4E79" w:val="clear"/>
-          </w:tcPr>
-          <w:p>
-            <w:r>
-              <w:rPr>
-                <w:b/>
-                <w:color w:val="FFFFFF"/>
-                <w:sz w:val="20"/>
-              </w:rPr>
-              <w:t>Challenge many Melbourne operators face</w:t>
-            </w:r>
-          </w:p>
-        </w:tc>
-        <w:tc>
-          <w:tcPr>
-            <w:tcW w:type="dxa" w:w="4680"/>
-            <w:shd w:fill="1F4E79" w:val="clear"/>
-          </w:tcPr>
-          <w:p>
-            <w:r>
-              <w:rPr>
-                <w:b/>
-                <w:color w:val="FFFFFF"/>
-                <w:sz w:val="20"/>
-              </w:rPr>
-              <w:t>How WasteVantage helps</w:t>
-            </w:r>
-          </w:p>
-        </w:tc>
-      </w:tr>
-      <w:tr>
-        <w:tc>
-          <w:tcPr>
-            <w:tcW w:type="dxa" w:w="4680"/>
-          </w:tcPr>
-          <w:p>
-            <w:r>
-              <w:rPr>
-                <w:sz w:val="20"/>
-              </w:rPr>
-              <w:t>High volume of skip deliveries, pickups and swaps</w:t>
-            </w:r>
-          </w:p>
-        </w:tc>
-        <w:tc>
-          <w:tcPr>
-            <w:tcW w:type="dxa" w:w="4680"/>
-          </w:tcPr>
-          <w:p>
-            <w:r>
-              <w:rPr>
-                <w:sz w:val="20"/>
-              </w:rPr>
-              <w:t>Smart scheduling &amp; dispatch so jobs aren't missed or double-booked</w:t>
-            </w:r>
-          </w:p>
-        </w:tc>
-      </w:tr>
-      <w:tr>
-        <w:tc>
-          <w:tcPr>
-            <w:tcW w:type="dxa" w:w="4680"/>
-          </w:tcPr>
-          <w:p>
-            <w:r>
-              <w:rPr>
-                <w:sz w:val="20"/>
-              </w:rPr>
-              <w:t>"Where is that bin?" / lost assets</w:t>
-            </w:r>
-          </w:p>
-        </w:tc>
-        <w:tc>
-          <w:tcPr>
-            <w:tcW w:type="dxa" w:w="4680"/>
-          </w:tcPr>
-          <w:p>
-            <w:r>
-              <w:rPr>
-                <w:sz w:val="20"/>
-              </w:rPr>
-              <w:t>Real-time bin status, location and customer tracking</w:t>
-            </w:r>
-          </w:p>
-        </w:tc>
-      </w:tr>
-      <w:tr>
-        <w:tc>
-          <w:tcPr>
-            <w:tcW w:type="dxa" w:w="4680"/>
-          </w:tcPr>
-          <w:p>
-            <w:r>
-              <w:rPr>
-                <w:sz w:val="20"/>
-              </w:rPr>
-              <w:t>Drivers needing paper run sheets and constant office calls</w:t>
-            </w:r>
-          </w:p>
-        </w:tc>
-        <w:tc>
-          <w:tcPr>
-            <w:tcW w:type="dxa" w:w="4680"/>
-          </w:tcPr>
-          <w:p>
-            <w:r>
-              <w:rPr>
-                <w:sz w:val="20"/>
-              </w:rPr>
-              <w:t>Automated run sheets on driver phones + live job updates</w:t>
-            </w:r>
-          </w:p>
-        </w:tc>
-      </w:tr>
-      <w:tr>
-        <w:tc>
-          <w:tcPr>
-            <w:tcW w:type="dxa" w:w="4680"/>
-          </w:tcPr>
-          <w:p>
-            <w:r>
-              <w:rPr>
-                <w:sz w:val="20"/>
-              </w:rPr>
-              <w:t>Slow or messy invoicing after jobs close</w:t>
-            </w:r>
-          </w:p>
-        </w:tc>
-        <w:tc>
-          <w:tcPr>
-            <w:tcW w:type="dxa" w:w="4680"/>
-          </w:tcPr>
-          <w:p>
-            <w:r>
-              <w:rPr>
-                <w:sz w:val="20"/>
-              </w:rPr>
-              <w:t>One-click / same-day invoicing synced to Xero or MYOB</w:t>
-            </w:r>
-          </w:p>
-        </w:tc>
-      </w:tr>
-      <w:tr>
-        <w:tc>
-          <w:tcPr>
-            <w:tcW w:type="dxa" w:w="4680"/>
-          </w:tcPr>
-          <w:p>
-            <w:r>
-              <w:rPr>
-                <w:sz w:val="20"/>
-              </w:rPr>
-              <w:t>Customers chasing ETAs</w:t>
-            </w:r>
-          </w:p>
-        </w:tc>
-        <w:tc>
-          <w:tcPr>
-            <w:tcW w:type="dxa" w:w="4680"/>
-          </w:tcPr>
-          <w:p>
-            <w:r>
-              <w:rPr>
-                <w:sz w:val="20"/>
-              </w:rPr>
-              <w:t>Automated SMS / notifications and clearer service proof</w:t>
-            </w:r>
-          </w:p>
-        </w:tc>
-      </w:tr>
-      <w:tr>
-        <w:tc>
-          <w:tcPr>
-            <w:tcW w:type="dxa" w:w="4680"/>
-          </w:tcPr>
-          <w:p>
-            <w:r>
-              <w:rPr>
-                <w:sz w:val="20"/>
-              </w:rPr>
-              <w:t>Growing into rearlift or garden bags alongside skips</w:t>
-            </w:r>
-          </w:p>
-        </w:tc>
-        <w:tc>
-          <w:tcPr>
-            <w:tcW w:type="dxa" w:w="4680"/>
-          </w:tcPr>
-          <w:p>
-            <w:r>
-              <w:rPr>
-                <w:sz w:val="20"/>
-              </w:rPr>
-              <w:t>One platform for multi-stream operations</w:t>
-            </w:r>
-          </w:p>
-        </w:tc>
-      </w:tr>
-    </w:tbl>
-    <w:p/>
     <w:p>
       <w:pPr>
         <w:spacing w:after="120"/>
@@ -645,150 +407,81 @@
         <w:rPr>
           <w:rFonts w:ascii="Calibri" w:hAnsi="Calibri"/>
           <w:b w:val="0"/>
-          <w:i w:val="0"/>
           <w:sz w:val="22"/>
         </w:rPr>
-        <w:t>Built and supported in Australia for local operators — not a generic overseas logistics tool bolted onto waste.</w:t>
-      </w:r>
-    </w:p>
-    <w:p>
-      <w:r>
-        <w:rPr>
-          <w:rFonts w:ascii="Calibri" w:hAnsi="Calibri"/>
-          <w:b/>
-          <w:color w:val="1F4E79"/>
-          <w:sz w:val="26"/>
-        </w:rPr>
-        <w:t>Why it makes sense to come in person</w:t>
       </w:r>
     </w:p>
     <w:p>
       <w:pPr>
-        <w:pStyle w:val="ListBullet"/>
-      </w:pPr>
-      <w:r>
-        <w:rPr>
-          <w:sz w:val="22"/>
-        </w:rPr>
-        <w:t>Free trade visitor registration for industry professionals via the expo site</w:t>
-      </w:r>
-    </w:p>
-    <w:p>
-      <w:pPr>
-        <w:pStyle w:val="ListBullet"/>
-      </w:pPr>
-      <w:r>
-        <w:rPr>
-          <w:sz w:val="22"/>
-        </w:rPr>
-        <w:t>Face-to-face demo beats a cold website click — bring your toughest operational question</w:t>
-      </w:r>
-    </w:p>
-    <w:p>
-      <w:pPr>
-        <w:pStyle w:val="ListBullet"/>
-      </w:pPr>
-      <w:r>
-        <w:rPr>
-          <w:sz w:val="22"/>
-        </w:rPr>
-        <w:t>See peers and suppliers in one venue while you're there (policy, recycling, fleet, tech)</w:t>
-      </w:r>
-    </w:p>
-    <w:p>
-      <w:pPr>
-        <w:pStyle w:val="ListBullet"/>
-      </w:pPr>
-      <w:r>
-        <w:rPr>
-          <w:sz w:val="22"/>
-        </w:rPr>
-        <w:t>Melbourne timing — ideal if you already service metro Melbourne and surrounds</w:t>
-      </w:r>
-    </w:p>
-    <w:p/>
-    <w:p>
-      <w:pPr>
-        <w:spacing w:after="40"/>
+        <w:spacing w:after="120"/>
       </w:pPr>
       <w:r>
         <w:rPr>
           <w:rFonts w:ascii="Calibri" w:hAnsi="Calibri"/>
           <w:b w:val="0"/>
-          <w:i w:val="0"/>
           <w:sz w:val="22"/>
         </w:rPr>
-        <w:t>If you're free on either day, we'd love 15–20 minutes at our stand to walk you through a demo tailored to skip / rearlift / garden bag work.</w:t>
+        <w:t>If you’re at the expo, reply with your preferred day (28 or 29 Oct) and we’ll hold 15 minutes for {{Company Name}}.</w:t>
       </w:r>
     </w:p>
-    <w:p/>
     <w:p>
       <w:pPr>
-        <w:spacing w:after="40"/>
+        <w:spacing w:after="120"/>
       </w:pPr>
       <w:r>
         <w:rPr>
           <w:rFonts w:ascii="Calibri" w:hAnsi="Calibri"/>
           <w:b w:val="0"/>
-          <w:i w:val="0"/>
           <w:sz w:val="22"/>
         </w:rPr>
-        <w:t>RSVP / book a time: reply to this email with a preferred day (28 or 29 Oct) and we'll hold a slot for {{Company Name}}.</w:t>
       </w:r>
     </w:p>
     <w:p>
       <w:pPr>
-        <w:spacing w:after="40"/>
+        <w:spacing w:after="120"/>
       </w:pPr>
       <w:r>
         <w:rPr>
           <w:rFonts w:ascii="Calibri" w:hAnsi="Calibri"/>
           <w:b w:val="0"/>
-          <w:i w:val="0"/>
           <w:sz w:val="22"/>
         </w:rPr>
-        <w:t>Expo info &amp; visitor registration: https://www.wasteexpoaustralia.com.au/</w:t>
+        <w:t>Expo: https://www.wasteexpoaustralia.com.au/</w:t>
       </w:r>
     </w:p>
     <w:p>
       <w:pPr>
-        <w:spacing w:after="40"/>
+        <w:spacing w:after="120"/>
       </w:pPr>
       <w:r>
         <w:rPr>
           <w:rFonts w:ascii="Calibri" w:hAnsi="Calibri"/>
           <w:b w:val="0"/>
-          <w:i w:val="0"/>
           <w:sz w:val="22"/>
         </w:rPr>
-        <w:t>Learn more about WasteVantage: https://ihublogistics.com/wastevantage/</w:t>
+        <w:t>WasteVantage: https://ihublogistics.com/wastevantage/</w:t>
       </w:r>
     </w:p>
-    <w:p/>
     <w:p>
       <w:pPr>
-        <w:spacing w:after="40"/>
+        <w:spacing w:after="120"/>
       </w:pPr>
       <w:r>
         <w:rPr>
           <w:rFonts w:ascii="Calibri" w:hAnsi="Calibri"/>
           <w:b w:val="0"/>
-          <w:i w:val="0"/>
           <w:sz w:val="22"/>
         </w:rPr>
-        <w:t>Looking forward to meeting you in Melbourne.</w:t>
       </w:r>
     </w:p>
-    <w:p/>
     <w:p>
       <w:pPr>
-        <w:spacing w:after="40"/>
+        <w:spacing w:after="120"/>
       </w:pPr>
       <w:r>
         <w:rPr>
           <w:rFonts w:ascii="Calibri" w:hAnsi="Calibri"/>
           <w:b w:val="0"/>
-          <w:i w:val="0"/>
           <w:sz w:val="22"/>
         </w:rPr>
         <w:t>Kind regards,</w:t>
@@ -796,13 +489,12 @@
     </w:p>
     <w:p>
       <w:pPr>
-        <w:spacing w:after="40"/>
+        <w:spacing w:after="120"/>
       </w:pPr>
       <w:r>
         <w:rPr>
           <w:rFonts w:ascii="Calibri" w:hAnsi="Calibri"/>
           <w:b w:val="0"/>
-          <w:i w:val="0"/>
           <w:sz w:val="22"/>
         </w:rPr>
         <w:t>{{Your Name}}</w:t>
@@ -810,27 +502,12 @@
     </w:p>
     <w:p>
       <w:pPr>
-        <w:spacing w:after="40"/>
+        <w:spacing w:after="120"/>
       </w:pPr>
       <w:r>
         <w:rPr>
           <w:rFonts w:ascii="Calibri" w:hAnsi="Calibri"/>
           <w:b w:val="0"/>
-          <w:i w:val="0"/>
-          <w:sz w:val="22"/>
-        </w:rPr>
-        <w:t>{{Your Title}}</w:t>
-      </w:r>
-    </w:p>
-    <w:p>
-      <w:pPr>
-        <w:spacing w:after="40"/>
-      </w:pPr>
-      <w:r>
-        <w:rPr>
-          <w:rFonts w:ascii="Calibri" w:hAnsi="Calibri"/>
-          <w:b w:val="0"/>
-          <w:i w:val="0"/>
           <w:sz w:val="22"/>
         </w:rPr>
         <w:t>WasteVantage</w:t>
@@ -838,44 +515,15 @@
     </w:p>
     <w:p>
       <w:pPr>
-        <w:spacing w:after="40"/>
+        <w:spacing w:after="120"/>
       </w:pPr>
       <w:r>
         <w:rPr>
           <w:rFonts w:ascii="Calibri" w:hAnsi="Calibri"/>
           <w:b w:val="0"/>
-          <w:i w:val="0"/>
           <w:sz w:val="22"/>
         </w:rPr>
-        <w:t>{{Your Phone}}</w:t>
-      </w:r>
-    </w:p>
-    <w:p>
-      <w:pPr>
-        <w:spacing w:after="40"/>
-      </w:pPr>
-      <w:r>
-        <w:rPr>
-          <w:rFonts w:ascii="Calibri" w:hAnsi="Calibri"/>
-          <w:b w:val="0"/>
-          <w:i w:val="0"/>
-          <w:sz w:val="22"/>
-        </w:rPr>
-        <w:t>{{Your Email}}</w:t>
-      </w:r>
-    </w:p>
-    <w:p>
-      <w:pPr>
-        <w:spacing w:after="40"/>
-      </w:pPr>
-      <w:r>
-        <w:rPr>
-          <w:rFonts w:ascii="Calibri" w:hAnsi="Calibri"/>
-          <w:b w:val="0"/>
-          <w:i w:val="0"/>
-          <w:sz w:val="22"/>
-        </w:rPr>
-        <w:t>https://ihublogistics.com/wastevantage/</w:t>
+        <w:t>{{Your Phone}} | {{Your Email}}</w:t>
       </w:r>
     </w:p>
     <w:p>
@@ -891,109 +539,167 @@
           <w:color w:val="1F4E79"/>
           <w:sz w:val="32"/>
         </w:rPr>
-        <w:t>Short follow-up email (if no reply after ~1 week)</w:t>
+        <w:t>Short follow-up</w:t>
       </w:r>
     </w:p>
     <w:p>
+      <w:pPr>
+        <w:spacing w:after="120"/>
+      </w:pPr>
       <w:r>
         <w:rPr>
+          <w:rFonts w:ascii="Calibri" w:hAnsi="Calibri"/>
           <w:b/>
           <w:sz w:val="22"/>
         </w:rPr>
-        <w:t xml:space="preserve">Subject: </w:t>
-      </w:r>
-      <w:r>
-        <w:rPr>
-          <w:sz w:val="22"/>
-        </w:rPr>
-        <w:t>Quick reminder — WasteVantage at Waste Expo (28–29 Oct)</w:t>
+        <w:t>Subject: Reminder — WasteVantage at Waste Expo (28–29 Oct)</w:t>
       </w:r>
     </w:p>
-    <w:p/>
     <w:p>
       <w:pPr>
-        <w:spacing w:after="40"/>
+        <w:spacing w:after="120"/>
       </w:pPr>
       <w:r>
         <w:rPr>
           <w:rFonts w:ascii="Calibri" w:hAnsi="Calibri"/>
           <w:b w:val="0"/>
-          <w:i w:val="0"/>
+          <w:sz w:val="22"/>
+        </w:rPr>
+      </w:r>
+    </w:p>
+    <w:p>
+      <w:pPr>
+        <w:spacing w:after="120"/>
+      </w:pPr>
+      <w:r>
+        <w:rPr>
+          <w:rFonts w:ascii="Calibri" w:hAnsi="Calibri"/>
+          <w:b w:val="0"/>
           <w:sz w:val="22"/>
         </w:rPr>
         <w:t>Hi {{First Name}},</w:t>
       </w:r>
     </w:p>
-    <w:p/>
     <w:p>
       <w:pPr>
-        <w:spacing w:after="40"/>
+        <w:spacing w:after="120"/>
       </w:pPr>
       <w:r>
         <w:rPr>
           <w:rFonts w:ascii="Calibri" w:hAnsi="Calibri"/>
           <w:b w:val="0"/>
-          <w:i w:val="0"/>
           <w:sz w:val="22"/>
         </w:rPr>
-        <w:t>Just a short follow-up on our invite to meet at Waste Expo Australia, 28–29 October 2026 at MCEC Melbourne.</w:t>
       </w:r>
     </w:p>
-    <w:p/>
     <w:p>
       <w:pPr>
-        <w:spacing w:after="40"/>
+        <w:spacing w:after="120"/>
       </w:pPr>
       <w:r>
         <w:rPr>
           <w:rFonts w:ascii="Calibri" w:hAnsi="Calibri"/>
           <w:b w:val="0"/>
-          <w:i w:val="0"/>
           <w:sz w:val="22"/>
         </w:rPr>
-        <w:t>We'll be showing WasteVantage live — bookings, bin tracking, driver apps and automated invoicing for skip, rearlift and garden bag operators.</w:t>
+        <w:t>Quick reminder: we’d love to see {{Company Name}} at Waste Expo Australia, 28–29 October 2026 (MCEC).</w:t>
       </w:r>
     </w:p>
-    <w:p/>
     <w:p>
       <w:pPr>
-        <w:spacing w:after="40"/>
+        <w:spacing w:after="120"/>
       </w:pPr>
       <w:r>
         <w:rPr>
           <w:rFonts w:ascii="Calibri" w:hAnsi="Calibri"/>
           <w:b w:val="0"/>
-          <w:i w:val="0"/>
           <w:sz w:val="22"/>
         </w:rPr>
-        <w:t>If you're attending, reply with your preferred day and we'll book a 15-minute demo for {{Company Name}}.</w:t>
       </w:r>
     </w:p>
-    <w:p/>
     <w:p>
       <w:pPr>
-        <w:spacing w:after="40"/>
+        <w:spacing w:after="120"/>
       </w:pPr>
       <w:r>
         <w:rPr>
           <w:rFonts w:ascii="Calibri" w:hAnsi="Calibri"/>
           <w:b w:val="0"/>
-          <w:i w:val="0"/>
           <w:sz w:val="22"/>
         </w:rPr>
-        <w:t>Expo: https://www.wasteexpoaustralia.com.au/</w:t>
+        <w:t>Come by our stand for a short WasteVantage demo — bookings, tracking and invoicing for skip / rearlift / garden bag operators.</w:t>
       </w:r>
     </w:p>
-    <w:p/>
     <w:p>
       <w:pPr>
-        <w:spacing w:after="40"/>
+        <w:spacing w:after="120"/>
       </w:pPr>
       <w:r>
         <w:rPr>
           <w:rFonts w:ascii="Calibri" w:hAnsi="Calibri"/>
           <w:b w:val="0"/>
-          <w:i w:val="0"/>
+          <w:sz w:val="22"/>
+        </w:rPr>
+      </w:r>
+    </w:p>
+    <w:p>
+      <w:pPr>
+        <w:spacing w:after="120"/>
+      </w:pPr>
+      <w:r>
+        <w:rPr>
+          <w:rFonts w:ascii="Calibri" w:hAnsi="Calibri"/>
+          <w:b w:val="0"/>
+          <w:sz w:val="22"/>
+        </w:rPr>
+        <w:t>Reply with your preferred day and we’ll book a time.</w:t>
+      </w:r>
+    </w:p>
+    <w:p>
+      <w:pPr>
+        <w:spacing w:after="120"/>
+      </w:pPr>
+      <w:r>
+        <w:rPr>
+          <w:rFonts w:ascii="Calibri" w:hAnsi="Calibri"/>
+          <w:b w:val="0"/>
+          <w:sz w:val="22"/>
+        </w:rPr>
+      </w:r>
+    </w:p>
+    <w:p>
+      <w:pPr>
+        <w:spacing w:after="120"/>
+      </w:pPr>
+      <w:r>
+        <w:rPr>
+          <w:rFonts w:ascii="Calibri" w:hAnsi="Calibri"/>
+          <w:b w:val="0"/>
+          <w:sz w:val="22"/>
+        </w:rPr>
+        <w:t>https://www.wasteexpoaustralia.com.au/</w:t>
+      </w:r>
+    </w:p>
+    <w:p>
+      <w:pPr>
+        <w:spacing w:after="120"/>
+      </w:pPr>
+      <w:r>
+        <w:rPr>
+          <w:rFonts w:ascii="Calibri" w:hAnsi="Calibri"/>
+          <w:b w:val="0"/>
+          <w:sz w:val="22"/>
+        </w:rPr>
+      </w:r>
+    </w:p>
+    <w:p>
+      <w:pPr>
+        <w:spacing w:after="120"/>
+      </w:pPr>
+      <w:r>
+        <w:rPr>
+          <w:rFonts w:ascii="Calibri" w:hAnsi="Calibri"/>
+          <w:b w:val="0"/>
           <w:sz w:val="22"/>
         </w:rPr>
         <w:t>Thanks,</w:t>
@@ -1001,105 +707,15 @@
     </w:p>
     <w:p>
       <w:pPr>
-        <w:spacing w:after="40"/>
+        <w:spacing w:after="120"/>
       </w:pPr>
       <w:r>
         <w:rPr>
           <w:rFonts w:ascii="Calibri" w:hAnsi="Calibri"/>
           <w:b w:val="0"/>
-          <w:i w:val="0"/>
           <w:sz w:val="22"/>
         </w:rPr>
         <w:t>{{Your Name}} | WasteVantage</w:t>
-      </w:r>
-    </w:p>
-    <w:p/>
-    <w:p>
-      <w:r>
-        <w:rPr>
-          <w:rFonts w:ascii="Calibri" w:hAnsi="Calibri"/>
-          <w:b/>
-          <w:color w:val="1F4E79"/>
-          <w:sz w:val="28"/>
-        </w:rPr>
-        <w:t>Sending tips</w:t>
-      </w:r>
-    </w:p>
-    <w:p>
-      <w:pPr>
-        <w:pStyle w:val="ListNumber"/>
-      </w:pPr>
-      <w:r>
-        <w:rPr>
-          <w:sz w:val="22"/>
-        </w:rPr>
-        <w:t>Personalise the first line with the company name (from the Excel list).</w:t>
-      </w:r>
-    </w:p>
-    <w:p>
-      <w:pPr>
-        <w:pStyle w:val="ListNumber"/>
-      </w:pPr>
-      <w:r>
-        <w:rPr>
-          <w:sz w:val="22"/>
-        </w:rPr>
-        <w:t>Prefer a named contact when you have one; otherwise "Hi team at {{Company Name}}" works.</w:t>
-      </w:r>
-    </w:p>
-    <w:p>
-      <w:pPr>
-        <w:pStyle w:val="ListNumber"/>
-      </w:pPr>
-      <w:r>
-        <w:rPr>
-          <w:sz w:val="22"/>
-        </w:rPr>
-        <w:t>Mention their service type if known (e.g. "as a Melbourne skip bin operator…").</w:t>
-      </w:r>
-    </w:p>
-    <w:p>
-      <w:pPr>
-        <w:pStyle w:val="ListNumber"/>
-      </w:pPr>
-      <w:r>
-        <w:rPr>
-          <w:sz w:val="22"/>
-        </w:rPr>
-        <w:t>Add your booth/stand number once confirmed by the expo organisers.</w:t>
-      </w:r>
-    </w:p>
-    <w:p>
-      <w:pPr>
-        <w:pStyle w:val="ListNumber"/>
-      </w:pPr>
-      <w:r>
-        <w:rPr>
-          <w:sz w:val="22"/>
-        </w:rPr>
-        <w:t>Keep BCC empty for personalised outreach; send one-to-one or via your CRM.</w:t>
-      </w:r>
-    </w:p>
-    <w:p>
-      <w:pPr>
-        <w:pStyle w:val="ListNumber"/>
-      </w:pPr>
-      <w:r>
-        <w:rPr>
-          <w:sz w:val="22"/>
-        </w:rPr>
-        <w:t>Confirm you are registered as an exhibitor and that visitor registration is free before promising that in the email.</w:t>
-      </w:r>
-    </w:p>
-    <w:p>
-      <w:pPr>
-        <w:pStyle w:val="ListNumber"/>
-      </w:pPr>
-      <w:r>
-        <w:rPr>
-          <w:sz w:val="22"/>
-        </w:rPr>
-        <w:t>Replace all {{placeholders}} before sending.</w:t>
       </w:r>
     </w:p>
     <w:sectPr>

</xml_diff>